<commit_message>
prueba de disperdion detalles
</commit_message>
<xml_diff>
--- a/matematica_3medio/prueba1_matematica_3medio_dispersion.docx
+++ b/matematica_3medio/prueba1_matematica_3medio_dispersion.docx
@@ -48,7 +48,7 @@
                 <w:lang w:val="es-CL" w:eastAsia="es-CL"/>
               </w:rPr>
               <w:drawing>
-                <wp:anchor distT="0" distB="0" distL="114300" distR="114300" simplePos="0" relativeHeight="251661824" behindDoc="0" locked="0" layoutInCell="1" allowOverlap="1" wp14:anchorId="0E4A2D9F" wp14:editId="207CE66E">
+                <wp:anchor distT="0" distB="0" distL="114300" distR="114300" simplePos="0" relativeHeight="251661824" behindDoc="0" locked="0" layoutInCell="1" allowOverlap="1" wp14:anchorId="0E4A2D9F" wp14:editId="093D258D">
                   <wp:simplePos x="0" y="0"/>
                   <wp:positionH relativeFrom="column">
                     <wp:posOffset>313055</wp:posOffset>
@@ -1197,7 +1197,23 @@
           <w:sz w:val="20"/>
           <w:szCs w:val="20"/>
         </w:rPr>
-        <w:t xml:space="preserve"> datos en múltiples valores. </w:t>
+        <w:t xml:space="preserve"> </w:t>
+      </w:r>
+      <w:proofErr w:type="spellStart"/>
+      <w:r>
+        <w:rPr>
+          <w:sz w:val="20"/>
+          <w:szCs w:val="20"/>
+        </w:rPr>
+        <w:t>datos</w:t>
+      </w:r>
+      <w:proofErr w:type="spellEnd"/>
+      <w:r>
+        <w:rPr>
+          <w:sz w:val="20"/>
+          <w:szCs w:val="20"/>
+        </w:rPr>
+        <w:t xml:space="preserve"> en múltiples valores. </w:t>
       </w:r>
     </w:p>
     <w:p>
@@ -1230,7 +1246,39 @@
           <w:sz w:val="20"/>
           <w:szCs w:val="20"/>
         </w:rPr>
-        <w:t xml:space="preserve"> y el mínimo de una muestra. </w:t>
+        <w:t xml:space="preserve"> y </w:t>
+      </w:r>
+      <w:proofErr w:type="spellStart"/>
+      <w:r>
+        <w:rPr>
+          <w:sz w:val="20"/>
+          <w:szCs w:val="20"/>
+        </w:rPr>
+        <w:t>el</w:t>
+      </w:r>
+      <w:proofErr w:type="spellEnd"/>
+      <w:r>
+        <w:rPr>
+          <w:sz w:val="20"/>
+          <w:szCs w:val="20"/>
+        </w:rPr>
+        <w:t xml:space="preserve"> </w:t>
+      </w:r>
+      <w:proofErr w:type="spellStart"/>
+      <w:r>
+        <w:rPr>
+          <w:sz w:val="20"/>
+          <w:szCs w:val="20"/>
+        </w:rPr>
+        <w:t>mínimo</w:t>
+      </w:r>
+      <w:proofErr w:type="spellEnd"/>
+      <w:r>
+        <w:rPr>
+          <w:sz w:val="20"/>
+          <w:szCs w:val="20"/>
+        </w:rPr>
+        <w:t xml:space="preserve"> de una muestra. </w:t>
       </w:r>
     </w:p>
     <w:p>
@@ -1263,7 +1311,23 @@
           <w:sz w:val="20"/>
           <w:szCs w:val="20"/>
         </w:rPr>
-        <w:t xml:space="preserve"> de la distribución de los datos en un solo valor. </w:t>
+        <w:t xml:space="preserve"> de la </w:t>
+      </w:r>
+      <w:proofErr w:type="spellStart"/>
+      <w:r>
+        <w:rPr>
+          <w:sz w:val="20"/>
+          <w:szCs w:val="20"/>
+        </w:rPr>
+        <w:t>distribución</w:t>
+      </w:r>
+      <w:proofErr w:type="spellEnd"/>
+      <w:r>
+        <w:rPr>
+          <w:sz w:val="20"/>
+          <w:szCs w:val="20"/>
+        </w:rPr>
+        <w:t xml:space="preserve"> de los datos en un solo valor. </w:t>
       </w:r>
     </w:p>
     <w:p>
@@ -1312,7 +1376,23 @@
           <w:sz w:val="20"/>
           <w:szCs w:val="20"/>
         </w:rPr>
-        <w:t xml:space="preserve"> de cada dato respecto a la media. </w:t>
+        <w:t xml:space="preserve"> de </w:t>
+      </w:r>
+      <w:proofErr w:type="spellStart"/>
+      <w:r>
+        <w:rPr>
+          <w:sz w:val="20"/>
+          <w:szCs w:val="20"/>
+        </w:rPr>
+        <w:t>cada</w:t>
+      </w:r>
+      <w:proofErr w:type="spellEnd"/>
+      <w:r>
+        <w:rPr>
+          <w:sz w:val="20"/>
+          <w:szCs w:val="20"/>
+        </w:rPr>
+        <w:t xml:space="preserve"> dato respecto a la media. </w:t>
       </w:r>
     </w:p>
     <w:p>
@@ -1453,7 +1533,39 @@
           <w:sz w:val="20"/>
           <w:szCs w:val="20"/>
         </w:rPr>
-        <w:t xml:space="preserve"> que más se </w:t>
+        <w:t xml:space="preserve"> </w:t>
+      </w:r>
+      <w:proofErr w:type="spellStart"/>
+      <w:r>
+        <w:rPr>
+          <w:sz w:val="20"/>
+          <w:szCs w:val="20"/>
+        </w:rPr>
+        <w:t>que</w:t>
+      </w:r>
+      <w:proofErr w:type="spellEnd"/>
+      <w:r>
+        <w:rPr>
+          <w:sz w:val="20"/>
+          <w:szCs w:val="20"/>
+        </w:rPr>
+        <w:t xml:space="preserve"> </w:t>
+      </w:r>
+      <w:proofErr w:type="spellStart"/>
+      <w:r>
+        <w:rPr>
+          <w:sz w:val="20"/>
+          <w:szCs w:val="20"/>
+        </w:rPr>
+        <w:t>más</w:t>
+      </w:r>
+      <w:proofErr w:type="spellEnd"/>
+      <w:r>
+        <w:rPr>
+          <w:sz w:val="20"/>
+          <w:szCs w:val="20"/>
+        </w:rPr>
+        <w:t xml:space="preserve"> se </w:t>
       </w:r>
       <w:proofErr w:type="spellStart"/>
       <w:r>
@@ -1551,7 +1663,55 @@
           <w:sz w:val="20"/>
           <w:szCs w:val="20"/>
         </w:rPr>
-        <w:t xml:space="preserve"> los datos están desordenados. </w:t>
+        <w:t xml:space="preserve"> </w:t>
+      </w:r>
+      <w:proofErr w:type="spellStart"/>
+      <w:r>
+        <w:rPr>
+          <w:sz w:val="20"/>
+          <w:szCs w:val="20"/>
+        </w:rPr>
+        <w:t>los</w:t>
+      </w:r>
+      <w:proofErr w:type="spellEnd"/>
+      <w:r>
+        <w:rPr>
+          <w:sz w:val="20"/>
+          <w:szCs w:val="20"/>
+        </w:rPr>
+        <w:t xml:space="preserve"> </w:t>
+      </w:r>
+      <w:proofErr w:type="spellStart"/>
+      <w:r>
+        <w:rPr>
+          <w:sz w:val="20"/>
+          <w:szCs w:val="20"/>
+        </w:rPr>
+        <w:t>datos</w:t>
+      </w:r>
+      <w:proofErr w:type="spellEnd"/>
+      <w:r>
+        <w:rPr>
+          <w:sz w:val="20"/>
+          <w:szCs w:val="20"/>
+        </w:rPr>
+        <w:t xml:space="preserve"> </w:t>
+      </w:r>
+      <w:proofErr w:type="spellStart"/>
+      <w:r>
+        <w:rPr>
+          <w:sz w:val="20"/>
+          <w:szCs w:val="20"/>
+        </w:rPr>
+        <w:t>están</w:t>
+      </w:r>
+      <w:proofErr w:type="spellEnd"/>
+      <w:r>
+        <w:rPr>
+          <w:sz w:val="20"/>
+          <w:szCs w:val="20"/>
+        </w:rPr>
+        <w:t xml:space="preserve"> desordenados. </w:t>
       </w:r>
     </w:p>
     <w:p>
@@ -1649,7 +1809,23 @@
           <w:sz w:val="20"/>
           <w:szCs w:val="20"/>
         </w:rPr>
-        <w:t xml:space="preserve"> dato mayor y el menor.</w:t>
+        <w:t xml:space="preserve"> </w:t>
+      </w:r>
+      <w:proofErr w:type="spellStart"/>
+      <w:r>
+        <w:rPr>
+          <w:sz w:val="20"/>
+          <w:szCs w:val="20"/>
+        </w:rPr>
+        <w:t>dato</w:t>
+      </w:r>
+      <w:proofErr w:type="spellEnd"/>
+      <w:r>
+        <w:rPr>
+          <w:sz w:val="20"/>
+          <w:szCs w:val="20"/>
+        </w:rPr>
+        <w:t xml:space="preserve"> mayor y el menor.</w:t>
       </w:r>
     </w:p>
     <w:p>
@@ -1778,7 +1954,23 @@
           <w:sz w:val="20"/>
           <w:szCs w:val="20"/>
         </w:rPr>
-        <w:t xml:space="preserve"> tiene la mayor frecuencia absoluta. </w:t>
+        <w:t xml:space="preserve"> </w:t>
+      </w:r>
+      <w:proofErr w:type="spellStart"/>
+      <w:r>
+        <w:rPr>
+          <w:sz w:val="20"/>
+          <w:szCs w:val="20"/>
+        </w:rPr>
+        <w:t>tiene</w:t>
+      </w:r>
+      <w:proofErr w:type="spellEnd"/>
+      <w:r>
+        <w:rPr>
+          <w:sz w:val="20"/>
+          <w:szCs w:val="20"/>
+        </w:rPr>
+        <w:t xml:space="preserve"> la mayor frecuencia absoluta. </w:t>
       </w:r>
     </w:p>
     <w:p>
@@ -1827,7 +2019,23 @@
           <w:sz w:val="20"/>
           <w:szCs w:val="20"/>
         </w:rPr>
-        <w:t xml:space="preserve"> valor más alto del conjunto de datos. </w:t>
+        <w:t xml:space="preserve"> valor </w:t>
+      </w:r>
+      <w:proofErr w:type="spellStart"/>
+      <w:r>
+        <w:rPr>
+          <w:sz w:val="20"/>
+          <w:szCs w:val="20"/>
+        </w:rPr>
+        <w:t>más</w:t>
+      </w:r>
+      <w:proofErr w:type="spellEnd"/>
+      <w:r>
+        <w:rPr>
+          <w:sz w:val="20"/>
+          <w:szCs w:val="20"/>
+        </w:rPr>
+        <w:t xml:space="preserve"> alto del conjunto de datos. </w:t>
       </w:r>
     </w:p>
     <w:p>
@@ -1925,7 +2133,23 @@
           <w:sz w:val="20"/>
           <w:szCs w:val="20"/>
         </w:rPr>
-        <w:t xml:space="preserve"> central exacto. </w:t>
+        <w:t xml:space="preserve"> central </w:t>
+      </w:r>
+      <w:proofErr w:type="spellStart"/>
+      <w:r>
+        <w:rPr>
+          <w:sz w:val="20"/>
+          <w:szCs w:val="20"/>
+        </w:rPr>
+        <w:t>exacto</w:t>
+      </w:r>
+      <w:proofErr w:type="spellEnd"/>
+      <w:r>
+        <w:rPr>
+          <w:sz w:val="20"/>
+          <w:szCs w:val="20"/>
+        </w:rPr>
+        <w:t xml:space="preserve">. </w:t>
       </w:r>
     </w:p>
     <w:p>
@@ -1974,7 +2198,23 @@
           <w:sz w:val="20"/>
           <w:szCs w:val="20"/>
         </w:rPr>
-        <w:t xml:space="preserve"> de los dos datos centrales cuando están ordenados de menor a mayor.</w:t>
+        <w:t xml:space="preserve"> de </w:t>
+      </w:r>
+      <w:proofErr w:type="spellStart"/>
+      <w:r>
+        <w:rPr>
+          <w:sz w:val="20"/>
+          <w:szCs w:val="20"/>
+        </w:rPr>
+        <w:t>los</w:t>
+      </w:r>
+      <w:proofErr w:type="spellEnd"/>
+      <w:r>
+        <w:rPr>
+          <w:sz w:val="20"/>
+          <w:szCs w:val="20"/>
+        </w:rPr>
+        <w:t xml:space="preserve"> dos datos centrales cuando están ordenados de menor a mayor.</w:t>
       </w:r>
     </w:p>
     <w:p>
@@ -2331,7 +2571,23 @@
           <w:sz w:val="20"/>
           <w:szCs w:val="20"/>
         </w:rPr>
-        <w:t xml:space="preserve"> total de todas las variables cuantitativas. </w:t>
+        <w:t xml:space="preserve"> total de </w:t>
+      </w:r>
+      <w:proofErr w:type="spellStart"/>
+      <w:r>
+        <w:rPr>
+          <w:sz w:val="20"/>
+          <w:szCs w:val="20"/>
+        </w:rPr>
+        <w:t>todas</w:t>
+      </w:r>
+      <w:proofErr w:type="spellEnd"/>
+      <w:r>
+        <w:rPr>
+          <w:sz w:val="20"/>
+          <w:szCs w:val="20"/>
+        </w:rPr>
+        <w:t xml:space="preserve"> las variables cuantitativas. </w:t>
       </w:r>
     </w:p>
     <w:p>
@@ -2413,7 +2669,23 @@
           <w:sz w:val="20"/>
           <w:szCs w:val="20"/>
         </w:rPr>
-        <w:t xml:space="preserve"> datos extremos.</w:t>
+        <w:t xml:space="preserve"> </w:t>
+      </w:r>
+      <w:proofErr w:type="spellStart"/>
+      <w:r>
+        <w:rPr>
+          <w:sz w:val="20"/>
+          <w:szCs w:val="20"/>
+        </w:rPr>
+        <w:t>datos</w:t>
+      </w:r>
+      <w:proofErr w:type="spellEnd"/>
+      <w:r>
+        <w:rPr>
+          <w:sz w:val="20"/>
+          <w:szCs w:val="20"/>
+        </w:rPr>
+        <w:t xml:space="preserve"> extremos.</w:t>
       </w:r>
     </w:p>
     <w:p>
@@ -2492,7 +2764,23 @@
           <w:sz w:val="20"/>
           <w:szCs w:val="20"/>
         </w:rPr>
-        <w:t xml:space="preserve"> no se puede calcular si hay valores con decimales. </w:t>
+        <w:t xml:space="preserve"> no se </w:t>
+      </w:r>
+      <w:proofErr w:type="spellStart"/>
+      <w:r>
+        <w:rPr>
+          <w:sz w:val="20"/>
+          <w:szCs w:val="20"/>
+        </w:rPr>
+        <w:t>puede</w:t>
+      </w:r>
+      <w:proofErr w:type="spellEnd"/>
+      <w:r>
+        <w:rPr>
+          <w:sz w:val="20"/>
+          <w:szCs w:val="20"/>
+        </w:rPr>
+        <w:t xml:space="preserve"> calcular si hay valores con decimales. </w:t>
       </w:r>
     </w:p>
     <w:p>
@@ -2606,7 +2894,23 @@
           <w:sz w:val="20"/>
           <w:szCs w:val="20"/>
         </w:rPr>
-        <w:t xml:space="preserve"> inalterado por valores extremos o atípicos. </w:t>
+        <w:t xml:space="preserve"> </w:t>
+      </w:r>
+      <w:proofErr w:type="spellStart"/>
+      <w:r>
+        <w:rPr>
+          <w:sz w:val="20"/>
+          <w:szCs w:val="20"/>
+        </w:rPr>
+        <w:t>inalterado</w:t>
+      </w:r>
+      <w:proofErr w:type="spellEnd"/>
+      <w:r>
+        <w:rPr>
+          <w:sz w:val="20"/>
+          <w:szCs w:val="20"/>
+        </w:rPr>
+        <w:t xml:space="preserve"> por valores extremos o atípicos. </w:t>
       </w:r>
     </w:p>
     <w:p>
@@ -2671,7 +2975,23 @@
           <w:sz w:val="20"/>
           <w:szCs w:val="20"/>
         </w:rPr>
-        <w:t xml:space="preserve"> conocer el rango para ser calculado. </w:t>
+        <w:t xml:space="preserve"> </w:t>
+      </w:r>
+      <w:proofErr w:type="spellStart"/>
+      <w:r>
+        <w:rPr>
+          <w:sz w:val="20"/>
+          <w:szCs w:val="20"/>
+        </w:rPr>
+        <w:t>conocer</w:t>
+      </w:r>
+      <w:proofErr w:type="spellEnd"/>
+      <w:r>
+        <w:rPr>
+          <w:sz w:val="20"/>
+          <w:szCs w:val="20"/>
+        </w:rPr>
+        <w:t xml:space="preserve"> el rango para ser calculado. </w:t>
       </w:r>
     </w:p>
     <w:p>
@@ -2736,7 +3056,23 @@
           <w:sz w:val="20"/>
           <w:szCs w:val="20"/>
         </w:rPr>
-        <w:t xml:space="preserve"> todos los tiempos cronometrados son idénticos.</w:t>
+        <w:t xml:space="preserve"> </w:t>
+      </w:r>
+      <w:proofErr w:type="spellStart"/>
+      <w:r>
+        <w:rPr>
+          <w:sz w:val="20"/>
+          <w:szCs w:val="20"/>
+        </w:rPr>
+        <w:t>todos</w:t>
+      </w:r>
+      <w:proofErr w:type="spellEnd"/>
+      <w:r>
+        <w:rPr>
+          <w:sz w:val="20"/>
+          <w:szCs w:val="20"/>
+        </w:rPr>
+        <w:t xml:space="preserve"> los tiempos cronometrados son idénticos.</w:t>
       </w:r>
     </w:p>
     <w:p>
@@ -2860,7 +3196,23 @@
           <w:sz w:val="20"/>
           <w:szCs w:val="20"/>
         </w:rPr>
-        <w:t xml:space="preserve"> que logró la máxima velocidad en un solo intento. </w:t>
+        <w:t xml:space="preserve"> </w:t>
+      </w:r>
+      <w:proofErr w:type="spellStart"/>
+      <w:r>
+        <w:rPr>
+          <w:sz w:val="20"/>
+          <w:szCs w:val="20"/>
+        </w:rPr>
+        <w:t>que</w:t>
+      </w:r>
+      <w:proofErr w:type="spellEnd"/>
+      <w:r>
+        <w:rPr>
+          <w:sz w:val="20"/>
+          <w:szCs w:val="20"/>
+        </w:rPr>
+        <w:t xml:space="preserve"> logró la máxima velocidad en un solo intento. </w:t>
       </w:r>
     </w:p>
     <w:p>
@@ -2909,7 +3261,23 @@
           <w:sz w:val="20"/>
           <w:szCs w:val="20"/>
         </w:rPr>
-        <w:t xml:space="preserve"> más “confiable”, regular y predecible en su rendimiento. </w:t>
+        <w:t xml:space="preserve"> </w:t>
+      </w:r>
+      <w:proofErr w:type="spellStart"/>
+      <w:r>
+        <w:rPr>
+          <w:sz w:val="20"/>
+          <w:szCs w:val="20"/>
+        </w:rPr>
+        <w:t>más</w:t>
+      </w:r>
+      <w:proofErr w:type="spellEnd"/>
+      <w:r>
+        <w:rPr>
+          <w:sz w:val="20"/>
+          <w:szCs w:val="20"/>
+        </w:rPr>
+        <w:t xml:space="preserve"> “confiable”, regular y predecible en su rendimiento. </w:t>
       </w:r>
     </w:p>
     <w:p>
@@ -2958,7 +3326,23 @@
           <w:sz w:val="20"/>
           <w:szCs w:val="20"/>
         </w:rPr>
-        <w:t xml:space="preserve"> la diferencia entre el mejor y el peor tiempo. </w:t>
+        <w:t xml:space="preserve"> la </w:t>
+      </w:r>
+      <w:proofErr w:type="spellStart"/>
+      <w:r>
+        <w:rPr>
+          <w:sz w:val="20"/>
+          <w:szCs w:val="20"/>
+        </w:rPr>
+        <w:t>diferencia</w:t>
+      </w:r>
+      <w:proofErr w:type="spellEnd"/>
+      <w:r>
+        <w:rPr>
+          <w:sz w:val="20"/>
+          <w:szCs w:val="20"/>
+        </w:rPr>
+        <w:t xml:space="preserve"> entre el mejor y el peor tiempo. </w:t>
       </w:r>
     </w:p>
     <w:p>
@@ -3023,7 +3407,23 @@
           <w:sz w:val="20"/>
           <w:szCs w:val="20"/>
         </w:rPr>
-        <w:t xml:space="preserve"> tiempos de los entrenamientos. </w:t>
+        <w:t xml:space="preserve"> </w:t>
+      </w:r>
+      <w:proofErr w:type="spellStart"/>
+      <w:r>
+        <w:rPr>
+          <w:sz w:val="20"/>
+          <w:szCs w:val="20"/>
+        </w:rPr>
+        <w:t>tiempos</w:t>
+      </w:r>
+      <w:proofErr w:type="spellEnd"/>
+      <w:r>
+        <w:rPr>
+          <w:sz w:val="20"/>
+          <w:szCs w:val="20"/>
+        </w:rPr>
+        <w:t xml:space="preserve"> de los entrenamientos. </w:t>
       </w:r>
     </w:p>
     <w:p>
@@ -3072,7 +3472,23 @@
           <w:sz w:val="20"/>
           <w:szCs w:val="20"/>
         </w:rPr>
-        <w:t xml:space="preserve"> al corredor más rápido.</w:t>
+        <w:t xml:space="preserve"> al </w:t>
+      </w:r>
+      <w:proofErr w:type="spellStart"/>
+      <w:r>
+        <w:rPr>
+          <w:sz w:val="20"/>
+          <w:szCs w:val="20"/>
+        </w:rPr>
+        <w:t>corredor</w:t>
+      </w:r>
+      <w:proofErr w:type="spellEnd"/>
+      <w:r>
+        <w:rPr>
+          <w:sz w:val="20"/>
+          <w:szCs w:val="20"/>
+        </w:rPr>
+        <w:t xml:space="preserve"> más rápido.</w:t>
       </w:r>
     </w:p>
     <w:p>
@@ -3250,7 +3666,39 @@
           <w:sz w:val="20"/>
           <w:szCs w:val="20"/>
         </w:rPr>
-        <w:t xml:space="preserve"> más compleja de calcular. </w:t>
+        <w:t xml:space="preserve"> </w:t>
+      </w:r>
+      <w:proofErr w:type="spellStart"/>
+      <w:r>
+        <w:rPr>
+          <w:sz w:val="20"/>
+          <w:szCs w:val="20"/>
+        </w:rPr>
+        <w:t>más</w:t>
+      </w:r>
+      <w:proofErr w:type="spellEnd"/>
+      <w:r>
+        <w:rPr>
+          <w:sz w:val="20"/>
+          <w:szCs w:val="20"/>
+        </w:rPr>
+        <w:t xml:space="preserve"> </w:t>
+      </w:r>
+      <w:proofErr w:type="spellStart"/>
+      <w:r>
+        <w:rPr>
+          <w:sz w:val="20"/>
+          <w:szCs w:val="20"/>
+        </w:rPr>
+        <w:t>compleja</w:t>
+      </w:r>
+      <w:proofErr w:type="spellEnd"/>
+      <w:r>
+        <w:rPr>
+          <w:sz w:val="20"/>
+          <w:szCs w:val="20"/>
+        </w:rPr>
+        <w:t xml:space="preserve"> de calcular. </w:t>
       </w:r>
     </w:p>
     <w:p>
@@ -3315,7 +3763,23 @@
           <w:sz w:val="20"/>
           <w:szCs w:val="20"/>
         </w:rPr>
-        <w:t xml:space="preserve"> los dos valores extremos, ignorando por completo la información y distribución de todos los demás datos intermedios. </w:t>
+        <w:t xml:space="preserve"> </w:t>
+      </w:r>
+      <w:proofErr w:type="spellStart"/>
+      <w:r>
+        <w:rPr>
+          <w:sz w:val="20"/>
+          <w:szCs w:val="20"/>
+        </w:rPr>
+        <w:t>los</w:t>
+      </w:r>
+      <w:proofErr w:type="spellEnd"/>
+      <w:r>
+        <w:rPr>
+          <w:sz w:val="20"/>
+          <w:szCs w:val="20"/>
+        </w:rPr>
+        <w:t xml:space="preserve"> dos valores extremos, ignorando por completo la información y distribución de todos los demás datos intermedios. </w:t>
       </w:r>
     </w:p>
     <w:p>
@@ -3510,7 +3974,23 @@
           <w:sz w:val="20"/>
           <w:szCs w:val="20"/>
         </w:rPr>
-        <w:t xml:space="preserve"> por valores atípicos que la desviación media.</w:t>
+        <w:t xml:space="preserve"> </w:t>
+      </w:r>
+      <w:proofErr w:type="spellStart"/>
+      <w:r>
+        <w:rPr>
+          <w:sz w:val="20"/>
+          <w:szCs w:val="20"/>
+        </w:rPr>
+        <w:t>por</w:t>
+      </w:r>
+      <w:proofErr w:type="spellEnd"/>
+      <w:r>
+        <w:rPr>
+          <w:sz w:val="20"/>
+          <w:szCs w:val="20"/>
+        </w:rPr>
+        <w:t xml:space="preserve"> valores atípicos que la desviación media.</w:t>
       </w:r>
     </w:p>
     <w:p>
@@ -3736,7 +4216,23 @@
           <w:sz w:val="20"/>
           <w:szCs w:val="20"/>
         </w:rPr>
-        <w:t xml:space="preserve"> se calcula para extraer información a partir de los datos de una Muestra. </w:t>
+        <w:t xml:space="preserve"> se </w:t>
+      </w:r>
+      <w:proofErr w:type="spellStart"/>
+      <w:r>
+        <w:rPr>
+          <w:sz w:val="20"/>
+          <w:szCs w:val="20"/>
+        </w:rPr>
+        <w:t>calcula</w:t>
+      </w:r>
+      <w:proofErr w:type="spellEnd"/>
+      <w:r>
+        <w:rPr>
+          <w:sz w:val="20"/>
+          <w:szCs w:val="20"/>
+        </w:rPr>
+        <w:t xml:space="preserve"> para extraer información a partir de los datos de una Muestra. </w:t>
       </w:r>
     </w:p>
     <w:p>
@@ -3769,7 +4265,23 @@
           <w:sz w:val="20"/>
           <w:szCs w:val="20"/>
         </w:rPr>
-        <w:t xml:space="preserve"> de barras utilizado para frecuencias absolutas. </w:t>
+        <w:t xml:space="preserve"> de barras </w:t>
+      </w:r>
+      <w:proofErr w:type="spellStart"/>
+      <w:r>
+        <w:rPr>
+          <w:sz w:val="20"/>
+          <w:szCs w:val="20"/>
+        </w:rPr>
+        <w:t>utilizado</w:t>
+      </w:r>
+      <w:proofErr w:type="spellEnd"/>
+      <w:r>
+        <w:rPr>
+          <w:sz w:val="20"/>
+          <w:szCs w:val="20"/>
+        </w:rPr>
+        <w:t xml:space="preserve"> para frecuencias absolutas. </w:t>
       </w:r>
     </w:p>
     <w:p>
@@ -3818,7 +4330,23 @@
           <w:sz w:val="20"/>
           <w:szCs w:val="20"/>
         </w:rPr>
-        <w:t xml:space="preserve"> no puede ser medida numéricamente. </w:t>
+        <w:t xml:space="preserve"> no </w:t>
+      </w:r>
+      <w:proofErr w:type="spellStart"/>
+      <w:r>
+        <w:rPr>
+          <w:sz w:val="20"/>
+          <w:szCs w:val="20"/>
+        </w:rPr>
+        <w:t>puede</w:t>
+      </w:r>
+      <w:proofErr w:type="spellEnd"/>
+      <w:r>
+        <w:rPr>
+          <w:sz w:val="20"/>
+          <w:szCs w:val="20"/>
+        </w:rPr>
+        <w:t xml:space="preserve"> ser medida numéricamente. </w:t>
       </w:r>
     </w:p>
     <w:p>
@@ -4096,7 +4624,23 @@
           <w:sz w:val="20"/>
           <w:szCs w:val="20"/>
         </w:rPr>
-        <w:t xml:space="preserve"> de las desviaciones al cuadrado respecto a la media. </w:t>
+        <w:t xml:space="preserve"> de las </w:t>
+      </w:r>
+      <w:proofErr w:type="spellStart"/>
+      <w:r>
+        <w:rPr>
+          <w:sz w:val="20"/>
+          <w:szCs w:val="20"/>
+        </w:rPr>
+        <w:t>desviaciones</w:t>
+      </w:r>
+      <w:proofErr w:type="spellEnd"/>
+      <w:r>
+        <w:rPr>
+          <w:sz w:val="20"/>
+          <w:szCs w:val="20"/>
+        </w:rPr>
+        <w:t xml:space="preserve"> al cuadrado respecto a la media. </w:t>
       </w:r>
     </w:p>
     <w:p>
@@ -4129,7 +4673,23 @@
           <w:sz w:val="20"/>
           <w:szCs w:val="20"/>
         </w:rPr>
-        <w:t xml:space="preserve"> de las distancias absolutas de cada dato respecto a la media aritmética. </w:t>
+        <w:t xml:space="preserve"> de las </w:t>
+      </w:r>
+      <w:proofErr w:type="spellStart"/>
+      <w:r>
+        <w:rPr>
+          <w:sz w:val="20"/>
+          <w:szCs w:val="20"/>
+        </w:rPr>
+        <w:t>distancias</w:t>
+      </w:r>
+      <w:proofErr w:type="spellEnd"/>
+      <w:r>
+        <w:rPr>
+          <w:sz w:val="20"/>
+          <w:szCs w:val="20"/>
+        </w:rPr>
+        <w:t xml:space="preserve"> absolutas de cada dato respecto a la media aritmética. </w:t>
       </w:r>
     </w:p>
     <w:p>
@@ -4178,7 +4738,23 @@
           <w:sz w:val="20"/>
           <w:szCs w:val="20"/>
         </w:rPr>
-        <w:t xml:space="preserve"> se encuentra en el medio geométrico.</w:t>
+        <w:t xml:space="preserve"> se </w:t>
+      </w:r>
+      <w:proofErr w:type="spellStart"/>
+      <w:r>
+        <w:rPr>
+          <w:sz w:val="20"/>
+          <w:szCs w:val="20"/>
+        </w:rPr>
+        <w:t>encuentra</w:t>
+      </w:r>
+      <w:proofErr w:type="spellEnd"/>
+      <w:r>
+        <w:rPr>
+          <w:sz w:val="20"/>
+          <w:szCs w:val="20"/>
+        </w:rPr>
+        <w:t xml:space="preserve"> en el medio geométrico.</w:t>
       </w:r>
     </w:p>
     <w:p>
@@ -4507,7 +5083,39 @@
           <w:sz w:val="20"/>
           <w:szCs w:val="20"/>
         </w:rPr>
-        <w:t xml:space="preserve"> datos dividida en dos.</w:t>
+        <w:t xml:space="preserve"> </w:t>
+      </w:r>
+      <w:proofErr w:type="spellStart"/>
+      <w:r>
+        <w:rPr>
+          <w:sz w:val="20"/>
+          <w:szCs w:val="20"/>
+        </w:rPr>
+        <w:t>datos</w:t>
+      </w:r>
+      <w:proofErr w:type="spellEnd"/>
+      <w:r>
+        <w:rPr>
+          <w:sz w:val="20"/>
+          <w:szCs w:val="20"/>
+        </w:rPr>
+        <w:t xml:space="preserve"> </w:t>
+      </w:r>
+      <w:proofErr w:type="spellStart"/>
+      <w:r>
+        <w:rPr>
+          <w:sz w:val="20"/>
+          <w:szCs w:val="20"/>
+        </w:rPr>
+        <w:t>dividida</w:t>
+      </w:r>
+      <w:proofErr w:type="spellEnd"/>
+      <w:r>
+        <w:rPr>
+          <w:sz w:val="20"/>
+          <w:szCs w:val="20"/>
+        </w:rPr>
+        <w:t xml:space="preserve"> en dos.</w:t>
       </w:r>
     </w:p>
     <w:p>
@@ -4643,7 +5251,23 @@
           <w:sz w:val="20"/>
           <w:szCs w:val="20"/>
         </w:rPr>
-        <w:t xml:space="preserve"> es el doble de la Varianza. </w:t>
+        <w:t xml:space="preserve"> es </w:t>
+      </w:r>
+      <w:proofErr w:type="spellStart"/>
+      <w:r>
+        <w:rPr>
+          <w:sz w:val="20"/>
+          <w:szCs w:val="20"/>
+        </w:rPr>
+        <w:t>el</w:t>
+      </w:r>
+      <w:proofErr w:type="spellEnd"/>
+      <w:r>
+        <w:rPr>
+          <w:sz w:val="20"/>
+          <w:szCs w:val="20"/>
+        </w:rPr>
+        <w:t xml:space="preserve"> doble de la Varianza. </w:t>
       </w:r>
     </w:p>
     <w:p>
@@ -4725,7 +5349,23 @@
           <w:sz w:val="20"/>
           <w:szCs w:val="20"/>
         </w:rPr>
-        <w:t xml:space="preserve"> es la raíz cuadrada de la Desviación Estándar. </w:t>
+        <w:t xml:space="preserve"> es la </w:t>
+      </w:r>
+      <w:proofErr w:type="spellStart"/>
+      <w:r>
+        <w:rPr>
+          <w:sz w:val="20"/>
+          <w:szCs w:val="20"/>
+        </w:rPr>
+        <w:t>raíz</w:t>
+      </w:r>
+      <w:proofErr w:type="spellEnd"/>
+      <w:r>
+        <w:rPr>
+          <w:sz w:val="20"/>
+          <w:szCs w:val="20"/>
+        </w:rPr>
+        <w:t xml:space="preserve"> cuadrada de la Desviación Estándar. </w:t>
       </w:r>
     </w:p>
     <w:p>
@@ -4839,7 +5479,23 @@
           <w:sz w:val="20"/>
           <w:szCs w:val="20"/>
         </w:rPr>
-        <w:t xml:space="preserve"> dividiendo la Desviación Estándar por la cantidad de datos (</w:t>
+        <w:t xml:space="preserve"> </w:t>
+      </w:r>
+      <w:proofErr w:type="spellStart"/>
+      <w:r>
+        <w:rPr>
+          <w:sz w:val="20"/>
+          <w:szCs w:val="20"/>
+        </w:rPr>
+        <w:t>dividiendo</w:t>
+      </w:r>
+      <w:proofErr w:type="spellEnd"/>
+      <w:r>
+        <w:rPr>
+          <w:sz w:val="20"/>
+          <w:szCs w:val="20"/>
+        </w:rPr>
+        <w:t xml:space="preserve"> la Desviación Estándar por la cantidad de datos (</w:t>
       </w:r>
       <m:oMath>
         <m:r>
@@ -5556,7 +6212,39 @@
           <w:sz w:val="20"/>
           <w:szCs w:val="20"/>
         </w:rPr>
-        <w:t xml:space="preserve"> una mayor desviación indica que es más rápido. </w:t>
+        <w:t xml:space="preserve"> </w:t>
+      </w:r>
+      <w:proofErr w:type="spellStart"/>
+      <w:r>
+        <w:rPr>
+          <w:sz w:val="20"/>
+          <w:szCs w:val="20"/>
+        </w:rPr>
+        <w:t>una</w:t>
+      </w:r>
+      <w:proofErr w:type="spellEnd"/>
+      <w:r>
+        <w:rPr>
+          <w:sz w:val="20"/>
+          <w:szCs w:val="20"/>
+        </w:rPr>
+        <w:t xml:space="preserve"> mayor </w:t>
+      </w:r>
+      <w:proofErr w:type="spellStart"/>
+      <w:r>
+        <w:rPr>
+          <w:sz w:val="20"/>
+          <w:szCs w:val="20"/>
+        </w:rPr>
+        <w:t>desviación</w:t>
+      </w:r>
+      <w:proofErr w:type="spellEnd"/>
+      <w:r>
+        <w:rPr>
+          <w:sz w:val="20"/>
+          <w:szCs w:val="20"/>
+        </w:rPr>
+        <w:t xml:space="preserve"> indica que es más rápido. </w:t>
       </w:r>
     </w:p>
     <w:p>
@@ -5589,7 +6277,39 @@
           <w:sz w:val="20"/>
           <w:szCs w:val="20"/>
         </w:rPr>
-        <w:t xml:space="preserve"> su baja desviación estándar indica que es mucho más consistente y predecible. </w:t>
+        <w:t xml:space="preserve"> </w:t>
+      </w:r>
+      <w:proofErr w:type="spellStart"/>
+      <w:r>
+        <w:rPr>
+          <w:sz w:val="20"/>
+          <w:szCs w:val="20"/>
+        </w:rPr>
+        <w:t>su</w:t>
+      </w:r>
+      <w:proofErr w:type="spellEnd"/>
+      <w:r>
+        <w:rPr>
+          <w:sz w:val="20"/>
+          <w:szCs w:val="20"/>
+        </w:rPr>
+        <w:t xml:space="preserve"> baja </w:t>
+      </w:r>
+      <w:proofErr w:type="spellStart"/>
+      <w:r>
+        <w:rPr>
+          <w:sz w:val="20"/>
+          <w:szCs w:val="20"/>
+        </w:rPr>
+        <w:t>desviación</w:t>
+      </w:r>
+      <w:proofErr w:type="spellEnd"/>
+      <w:r>
+        <w:rPr>
+          <w:sz w:val="20"/>
+          <w:szCs w:val="20"/>
+        </w:rPr>
+        <w:t xml:space="preserve"> estándar indica que es mucho más consistente y predecible. </w:t>
       </w:r>
     </w:p>
     <w:p>
@@ -5639,7 +6359,55 @@
           <w:sz w:val="20"/>
           <w:szCs w:val="20"/>
         </w:rPr>
-        <w:t xml:space="preserve"> demostró tener los picos más altos de velocidad en la pista. </w:t>
+        <w:t xml:space="preserve"> </w:t>
+      </w:r>
+      <w:proofErr w:type="spellStart"/>
+      <w:r>
+        <w:rPr>
+          <w:sz w:val="20"/>
+          <w:szCs w:val="20"/>
+        </w:rPr>
+        <w:t>demostró</w:t>
+      </w:r>
+      <w:proofErr w:type="spellEnd"/>
+      <w:r>
+        <w:rPr>
+          <w:sz w:val="20"/>
+          <w:szCs w:val="20"/>
+        </w:rPr>
+        <w:t xml:space="preserve"> </w:t>
+      </w:r>
+      <w:proofErr w:type="spellStart"/>
+      <w:r>
+        <w:rPr>
+          <w:sz w:val="20"/>
+          <w:szCs w:val="20"/>
+        </w:rPr>
+        <w:t>tener</w:t>
+      </w:r>
+      <w:proofErr w:type="spellEnd"/>
+      <w:r>
+        <w:rPr>
+          <w:sz w:val="20"/>
+          <w:szCs w:val="20"/>
+        </w:rPr>
+        <w:t xml:space="preserve"> </w:t>
+      </w:r>
+      <w:proofErr w:type="spellStart"/>
+      <w:r>
+        <w:rPr>
+          <w:sz w:val="20"/>
+          <w:szCs w:val="20"/>
+        </w:rPr>
+        <w:t>los</w:t>
+      </w:r>
+      <w:proofErr w:type="spellEnd"/>
+      <w:r>
+        <w:rPr>
+          <w:sz w:val="20"/>
+          <w:szCs w:val="20"/>
+        </w:rPr>
+        <w:t xml:space="preserve"> picos más altos de velocidad en la pista. </w:t>
       </w:r>
     </w:p>
     <w:p>
@@ -5672,7 +6440,39 @@
           <w:sz w:val="20"/>
           <w:szCs w:val="20"/>
         </w:rPr>
-        <w:t xml:space="preserve"> es el único que tiene una varianza negativa.</w:t>
+        <w:t xml:space="preserve"> es </w:t>
+      </w:r>
+      <w:proofErr w:type="spellStart"/>
+      <w:r>
+        <w:rPr>
+          <w:sz w:val="20"/>
+          <w:szCs w:val="20"/>
+        </w:rPr>
+        <w:t>el</w:t>
+      </w:r>
+      <w:proofErr w:type="spellEnd"/>
+      <w:r>
+        <w:rPr>
+          <w:sz w:val="20"/>
+          <w:szCs w:val="20"/>
+        </w:rPr>
+        <w:t xml:space="preserve"> </w:t>
+      </w:r>
+      <w:proofErr w:type="spellStart"/>
+      <w:r>
+        <w:rPr>
+          <w:sz w:val="20"/>
+          <w:szCs w:val="20"/>
+        </w:rPr>
+        <w:t>único</w:t>
+      </w:r>
+      <w:proofErr w:type="spellEnd"/>
+      <w:r>
+        <w:rPr>
+          <w:sz w:val="20"/>
+          <w:szCs w:val="20"/>
+        </w:rPr>
+        <w:t xml:space="preserve"> que tiene una varianza negativa.</w:t>
       </w:r>
     </w:p>
     <w:p>
@@ -6034,7 +6834,39 @@
           <w:sz w:val="20"/>
           <w:szCs w:val="20"/>
         </w:rPr>
-        <w:t xml:space="preserve"> hacia abajo (muy afectada), mientras que la Mediana se mantendrá casi intacta. </w:t>
+        <w:t xml:space="preserve"> </w:t>
+      </w:r>
+      <w:proofErr w:type="spellStart"/>
+      <w:r>
+        <w:rPr>
+          <w:sz w:val="20"/>
+          <w:szCs w:val="20"/>
+        </w:rPr>
+        <w:t>hacia</w:t>
+      </w:r>
+      <w:proofErr w:type="spellEnd"/>
+      <w:r>
+        <w:rPr>
+          <w:sz w:val="20"/>
+          <w:szCs w:val="20"/>
+        </w:rPr>
+        <w:t xml:space="preserve"> </w:t>
+      </w:r>
+      <w:proofErr w:type="spellStart"/>
+      <w:r>
+        <w:rPr>
+          <w:sz w:val="20"/>
+          <w:szCs w:val="20"/>
+        </w:rPr>
+        <w:t>abajo</w:t>
+      </w:r>
+      <w:proofErr w:type="spellEnd"/>
+      <w:r>
+        <w:rPr>
+          <w:sz w:val="20"/>
+          <w:szCs w:val="20"/>
+        </w:rPr>
+        <w:t xml:space="preserve"> (muy afectada), mientras que la Mediana se mantendrá casi intacta. </w:t>
       </w:r>
     </w:p>
     <w:p>
@@ -6083,7 +6915,23 @@
           <w:sz w:val="20"/>
           <w:szCs w:val="20"/>
         </w:rPr>
-        <w:t xml:space="preserve">, pero la Media seguirá siendo exactamente 500 g. </w:t>
+        <w:t xml:space="preserve">, </w:t>
+      </w:r>
+      <w:proofErr w:type="spellStart"/>
+      <w:r>
+        <w:rPr>
+          <w:sz w:val="20"/>
+          <w:szCs w:val="20"/>
+        </w:rPr>
+        <w:t>pero</w:t>
+      </w:r>
+      <w:proofErr w:type="spellEnd"/>
+      <w:r>
+        <w:rPr>
+          <w:sz w:val="20"/>
+          <w:szCs w:val="20"/>
+        </w:rPr>
+        <w:t xml:space="preserve"> la Media seguirá siendo exactamente 500 g. </w:t>
       </w:r>
     </w:p>
     <w:p>
@@ -6116,7 +6964,23 @@
           <w:sz w:val="20"/>
           <w:szCs w:val="20"/>
         </w:rPr>
-        <w:t xml:space="preserve"> en 410 g de inmediato. </w:t>
+        <w:t xml:space="preserve"> </w:t>
+      </w:r>
+      <w:proofErr w:type="spellStart"/>
+      <w:r>
+        <w:rPr>
+          <w:sz w:val="20"/>
+          <w:szCs w:val="20"/>
+        </w:rPr>
+        <w:t>en</w:t>
+      </w:r>
+      <w:proofErr w:type="spellEnd"/>
+      <w:r>
+        <w:rPr>
+          <w:sz w:val="20"/>
+          <w:szCs w:val="20"/>
+        </w:rPr>
+        <w:t xml:space="preserve"> 410 g de inmediato. </w:t>
       </w:r>
     </w:p>
     <w:p>
@@ -6208,7 +7072,23 @@
           <w:sz w:val="20"/>
           <w:szCs w:val="20"/>
         </w:rPr>
-        <w:t xml:space="preserve"> a cero debido al peso </w:t>
+        <w:t xml:space="preserve"> a cero </w:t>
+      </w:r>
+      <w:proofErr w:type="spellStart"/>
+      <w:r>
+        <w:rPr>
+          <w:sz w:val="20"/>
+          <w:szCs w:val="20"/>
+        </w:rPr>
+        <w:t>debido</w:t>
+      </w:r>
+      <w:proofErr w:type="spellEnd"/>
+      <w:r>
+        <w:rPr>
+          <w:sz w:val="20"/>
+          <w:szCs w:val="20"/>
+        </w:rPr>
+        <w:t xml:space="preserve"> al peso </w:t>
       </w:r>
       <w:proofErr w:type="spellStart"/>
       <w:r>
@@ -6403,7 +7283,23 @@
           <w:sz w:val="20"/>
           <w:szCs w:val="20"/>
         </w:rPr>
-        <w:t xml:space="preserve"> mismo valor de la desviación media. </w:t>
+        <w:t xml:space="preserve"> </w:t>
+      </w:r>
+      <w:proofErr w:type="spellStart"/>
+      <w:r>
+        <w:rPr>
+          <w:sz w:val="20"/>
+          <w:szCs w:val="20"/>
+        </w:rPr>
+        <w:t>mismo</w:t>
+      </w:r>
+      <w:proofErr w:type="spellEnd"/>
+      <w:r>
+        <w:rPr>
+          <w:sz w:val="20"/>
+          <w:szCs w:val="20"/>
+        </w:rPr>
+        <w:t xml:space="preserve"> valor de la desviación media. </w:t>
       </w:r>
     </w:p>
     <w:p>
@@ -7236,6 +8132,7 @@
   <w:style w:type="character" w:default="1" w:styleId="Fuentedeprrafopredeter">
     <w:name w:val="Default Paragraph Font"/>
     <w:uiPriority w:val="1"/>
+    <w:semiHidden/>
     <w:unhideWhenUsed/>
   </w:style>
   <w:style w:type="table" w:default="1" w:styleId="Tablanormal">

</xml_diff>